<commit_message>
Finalize DogMAG submission provenance and ENA actions
</commit_message>
<xml_diff>
--- a/manuscript/dogmag_scientific_data_dogfirst_rewrite_20260815_reconciled.docx
+++ b/manuscript/dogmag_scientific_data_dogfirst_rewrite_20260815_reconciled.docx
@@ -488,7 +488,7 @@
           <w:rFonts w:ascii="Times New Roman" w:hAnsi="Times New Roman"/>
           <w:sz w:val="21"/>
         </w:rPr>
-        <w:t>Sample-linked input reads used for DogMAG assembly and MAG generation are identified by ENA project accessions PRJEB75753 for Dog_M0 input data, PRJEB82125 for DMD input and provenance records, PRJEB85420 for CaniMeta/Serteperti input and provenance records, and PRJEB115259 for DogMAG sample registrations, newly deposited mixed-kennel long-read WGS data and associated DogMAG genome records. Previously generated reads are cited here to document sample provenance and input-read availability; the DogMAG data record reports dog-wise assemblies, BASALT workflow summaries and reselected MAG candidate metadata, viral/prophage candidates and workflow metadata generated from these inputs.</w:t>
+        <w:t>Sample-linked input reads used for DogMAG assembly and MAG generation are identified by ENA project accessions PRJEB75753 for Dog_M0 input data, PRJEB82125 for DMD input and provenance records, PRJEB85420 for CaniMeta/Serteperti input and provenance records, and PRJEB115259 for DogMAG sample registrations, newly deposited mixed-kennel long-read WGS data and associated DogMAG genome records. Dog_M0 and Serteperti source-data provenance is described in the associated Scientific Data descriptor [24]. Previously generated reads are cited here to document sample provenance and input-read availability; the DogMAG data record reports dog-wise assemblies, BASALT workflow summaries and reselected MAG candidate metadata, viral/prophage candidates and workflow metadata generated from these inputs.</w:t>
       </w:r>
     </w:p>
     <w:p>
@@ -574,7 +574,7 @@
           <w:rFonts w:ascii="Times New Roman" w:hAnsi="Times New Roman"/>
           <w:sz w:val="21"/>
         </w:rPr>
-        <w:t>Previously published Dog_M0/Toti and method-comparison sequencing datasets are documented through their source publications. In the prior Scientific Data canine faecal microbiome dataset, Dog_M0/Toti was a single adult dog faecal sample collected shortly after defecation, stored initially at -20 degrees C and transferred to -80 degrees C within 24 h. DNA extraction, Illumina short-read sequencing and ONT long-read sequencing details are cited from that source rather than restated as new wet-lab work.</w:t>
+        <w:t>Previously published Dog_M0/Toti and method-comparison sequencing datasets are documented through their source publications. In the Scientific Data canine faecal microbiome dataset [24], Dog_M0/Toti was a single adult dog faecal sample collected shortly after defecation, stored initially at -20 degrees C and transferred to -80 degrees C within 24 h. DNA extraction, Illumina NovaSeq paired-end sequencing and ONT MinION long-read sequencing details are cited from that source rather than restated as new wet-lab work.</w:t>
       </w:r>
     </w:p>
     <w:p>
@@ -1686,7 +1686,7 @@
           <w:rFonts w:ascii="Times New Roman" w:hAnsi="Times New Roman"/>
           <w:sz w:val="21"/>
         </w:rPr>
-        <w:t>The DogMAG-derived dataset is deposited in public repositories for direct reuse. The deposited data record is organised around dog-first assemblies, summary-level BASALT provenance and quality metadata, the 3,418 reselected medium-quality-or-better MAG candidates, final externally dereplicated MAG representatives and viral/prophage candidate layers. The complete BASALT workspace, transient intermediate files, and the full set of 30,556 polished or reassembled candidate versions are not part of the deposited resource.</w:t>
+        <w:t>The DogMAG-derived dataset is organised for direct reuse through ENA and an associated article data package. The data record is organised around dog-first assemblies, summary-level BASALT provenance and quality metadata, the 3,418 reselected medium-quality-or-better MAG candidates, final externally dereplicated MAG representatives and viral/prophage candidate layers. The complete BASALT workspace, transient intermediate files, and the full set of 30,556 polished or reassembled candidate versions are not part of the deposited resource.</w:t>
       </w:r>
     </w:p>
     <w:p>
@@ -2362,7 +2362,7 @@
           <w:rFonts w:ascii="Times New Roman" w:hAnsi="Times New Roman"/>
           <w:sz w:val="21"/>
         </w:rPr>
-        <w:t>Supplementary Table 4 links each public dog-wise assembly identifier to public read and sample identifiers, read role, sequencing platform, ENA study accession and checksum fields where available.</w:t>
+        <w:t>Supplementary Table 4 links each public dog-wise assembly identifier to public read and sample identifiers, read role, sequencing platform, ENA study accession and checksum fields where available. The two workflow-named Toti/Dog_M0 NovaSeq FASTQs are linked to their corresponding public R1 and R2 ENA runs under PRJEB75753.</w:t>
       </w:r>
     </w:p>
     <w:p>
@@ -2556,7 +2556,7 @@
           <w:rFonts w:ascii="Times New Roman" w:hAnsi="Times New Roman"/>
           <w:sz w:val="21"/>
         </w:rPr>
-        <w:t>The final assembly layer comprises 41 dog-wise BASALT input assemblies linked to 277 FASTQ records in Supplementary Table 4: 30 Flye long-read-only assemblies and 11 OPERA-MS hybrid long-read/short-read assemblies. The same 41 public assembly identifiers are represented in the BASALT assembly index and final input list, providing a complete link between the deposited read provenance, assembly files and genome-recovery workflow.</w:t>
+        <w:t>The final assembly layer comprises 41 dog-wise BASALT input assemblies linked to 277 FASTQ records in Supplementary Table 4: 30 Flye long-read-only assemblies and 11 OPERA-MS hybrid long-read/short-read assemblies. The same 41 public assembly identifiers are represented in the BASALT assembly index and final input list, linking all 277 FASTQ records to the assembly files and genome-recovery workflow.</w:t>
       </w:r>
     </w:p>
     <w:p>
@@ -3003,7 +3003,7 @@
           <w:rFonts w:ascii="Times New Roman" w:hAnsi="Times New Roman"/>
           <w:sz w:val="21"/>
         </w:rPr>
-        <w:t xml:space="preserve"> Stable MAG identifier, source public assembly identifier, binner, BASALT bin identifier, completeness, contamination, genome size, contig count, N50, GC percentage, quality class, external dereplication cluster, representative status and taxonomy fields.</w:t>
+        <w:t xml:space="preserve"> Stable candidate and original-bin identifiers; selected and source FASTA names and portable paths; source origin and file checksums; binner or reassembly class; CheckM2 completeness and contamination; genome size, N50 and quality score; operational quality class; candidate counts per original bin group; dRep internal-filter, cluster and representative fields at 99% and 95% ANI; and GTDB-Tk classification fields where available. Blank dRep and GTDB-Tk fields identify the 196 candidates not retained by dRep's internal filtering.</w:t>
       </w:r>
     </w:p>
     <w:p>
@@ -3066,7 +3066,7 @@
           <w:rFonts w:ascii="Times New Roman" w:hAnsi="Times New Roman"/>
           <w:sz w:val="21"/>
         </w:rPr>
-        <w:t xml:space="preserve"> Viral candidate identifier, source branch, source assembly, contig identifier, length, geNomad score and taxonomy fields, CheckV quality fields, contamination estimate, MAG/bin context where applicable and deposited FASTA filename.</w:t>
+        <w:t xml:space="preserve"> Stable viral candidate identifier, source branch, source contig and assembly context, sequence MD5 where available, BASALT bin/MAG context, geNomad length, topology, score and taxonomy fields, and CheckV quality, completeness and contamination fields. Sequence files are organised by the stable candidate and source-contig identifiers in the associated article data package.</w:t>
       </w:r>
     </w:p>
     <w:p>
@@ -3108,7 +3108,7 @@
           <w:rFonts w:ascii="Times New Roman" w:hAnsi="Times New Roman"/>
           <w:sz w:val="21"/>
         </w:rPr>
-        <w:t xml:space="preserve"> Sample manifest and paired per-library results for 23 mixed-kennel source-cohort and 23 independent Waltham canine gut ONT metagenomes analysed against bacterial RefSeq and the DogMAG 95% ANI representative panel. Reported fields include cohort, library identifier, input primary reads, primary mapped reads, mapped-read fraction, taxonomically assigned reads and assigned-read fraction for BestAln and SpeciesEstimate, together with reference-panel identifiers and minitax run provenance.</w:t>
+        <w:t xml:space="preserve"> Paired per-library summary for 23 mixed-kennel source-cohort and 23 independent Waltham canine gut ONT metagenomes analysed against bacterial RefSeq and the DogMAG 95% ANI representative panel. Fields comprise validation library identifier, cohort, primary-read count, mapped-read fractions for each panel and their percentage-point difference, and final BestAln assigned-read fractions for each panel and their percentage-point difference. Detailed read-accounting and run-provenance files are included separately in the associated article data package.</w:t>
       </w:r>
     </w:p>
     <w:p>
@@ -3134,7 +3134,7 @@
           <w:rFonts w:ascii="Times New Roman" w:hAnsi="Times New Roman"/>
           <w:sz w:val="21"/>
         </w:rPr>
-        <w:t>Supplementary Table 9. ENA deposition status of the 135 DogMAG ANI95 representatives (20260815). MAG alias, MAG-derived sample and BioSample accessions, NCBI and GTDB taxonomic metadata, source assembly and sample links, genome-quality metrics, ERZ assembly-analysis accession where assigned, and assembly-submission status. The table distinguishes 122 submitted multi-contig MAG assemblies from 13 single-contig MAGs pending an ENA assembly-analysis submission route.</w:t>
+        <w:t>Supplementary Table 9. ENA deposition status of the 135 DogMAG ANI95 representatives (20260815). MAG alias, MAG-derived sample and BioSample accessions, NCBI and GTDB taxonomic metadata, source assembly and sample links, FASTA-derived contig count, genome-quality metrics, ERZ assembly-analysis accession where assigned, and assembly-submission status. The table distinguishes 122 submitted multi-contig MAG assemblies from 13 single-contig MAGs pending an ENA assembly-analysis submission route.</w:t>
       </w:r>
     </w:p>
     <w:p>
@@ -3155,7 +3155,7 @@
           <w:rFonts w:ascii="Times New Roman" w:hAnsi="Times New Roman"/>
           <w:sz w:val="21"/>
         </w:rPr>
-        <w:t>Sample-linked input reads used for DogMAG assembly generation, binning, MAG recovery and validation are available from the European Nucleotide Archive under PRJEB75753 for Dog_M0 input data, PRJEB82125 for DMD input and provenance records, PRJEB85420 for CaniMeta/Serteperti input and provenance records, and PRJEB115259 for DogMAG sample registrations, newly deposited mixed-kennel long-read WGS data and associated DogMAG genome records. The PRJEB115259 FASTQ submission table uses public-coded sample, library and file identifiers rather than dog names. Previously published ENA datasets are cited as input-data and sample-provenance records; the DogMAG data record consists of the dog-first assemblies, BASALT workflow summaries and reselected MAG candidate metadata, final MAG representatives, viral/prophage candidates, metadata tables and workflow outputs described above.</w:t>
+        <w:t>Sample-linked input reads used for DogMAG assembly generation, binning, MAG recovery and validation are available from the European Nucleotide Archive under PRJEB75753 for Dog_M0 input data, PRJEB82125 for DMD input and provenance records, PRJEB85420 for CaniMeta/Serteperti input and provenance records, and PRJEB115259 for DogMAG sample registrations, newly deposited mixed-kennel long-read WGS data and associated DogMAG genome records. The PRJEB115259 FASTQ submission table uses public-coded sample, library and file identifiers rather than dog names. Previously published ENA datasets are cited as input-data and sample-provenance records. The 122 submitted multi-contig representative MAG assemblies are identified by ERZ accessions in Supplementary Table 9; the 13 single-contig representatives remain explicitly marked as pending an ENA assembly-analysis route. Dog-wise assemblies, reselected candidate MAG FASTAs, viral/prophage candidate sequences, metadata tables and detailed workflow outputs are organised in the associated article data package. Its persistent repository identifier and anonymous first-round reviewer link will be added before manuscript submission.</w:t>
       </w:r>
     </w:p>
     <w:p>
@@ -3476,301 +3476,314 @@
     </w:p>
     <w:p>
       <w:pPr>
-        <w:spacing w:after="120" w:line="259" w:lineRule="auto"/>
+        <w:spacing w:after="60" w:line="240" w:lineRule="auto"/>
         <w:jc w:val="both"/>
       </w:pPr>
       <w:r>
         <w:rPr>
           <w:rFonts w:ascii="Times New Roman" w:hAnsi="Times New Roman"/>
-          <w:sz w:val="21"/>
+          <w:sz w:val="19"/>
         </w:rPr>
         <w:t>[1] Knight, R., Vrbanac, A., Taylor, B. C. et al. Best practices for analysing microbiomes. Nat Rev Microbiol 16, 410-422 (2018). https://doi.org/10.1038/s41579-018-0029-9</w:t>
       </w:r>
     </w:p>
     <w:p>
       <w:pPr>
-        <w:spacing w:after="120" w:line="259" w:lineRule="auto"/>
+        <w:spacing w:after="60" w:line="240" w:lineRule="auto"/>
         <w:jc w:val="both"/>
       </w:pPr>
       <w:r>
         <w:rPr>
           <w:rFonts w:ascii="Times New Roman" w:hAnsi="Times New Roman"/>
-          <w:sz w:val="21"/>
+          <w:sz w:val="19"/>
         </w:rPr>
         <w:t>[2] Quince, C., Walker, A. W., Simpson, J. T. et al. Shotgun metagenomics, from sampling to analysis. Nat Biotechnol 35, 833-844 (2017). https://doi.org/10.1038/nbt.3935</w:t>
       </w:r>
     </w:p>
     <w:p>
       <w:pPr>
-        <w:spacing w:after="120" w:line="259" w:lineRule="auto"/>
+        <w:spacing w:after="60" w:line="240" w:lineRule="auto"/>
         <w:jc w:val="both"/>
       </w:pPr>
       <w:r>
         <w:rPr>
           <w:rFonts w:ascii="Times New Roman" w:hAnsi="Times New Roman"/>
-          <w:sz w:val="21"/>
+          <w:sz w:val="19"/>
         </w:rPr>
         <w:t>[3] Coelho, L. P., Kultima, J. R., Costea, P. I. et al. Similarity of the dog and human gut microbiomes in gene content and response to diet. Microbiome 6, 72 (2018). https://doi.org/10.1186/s40168-018-0450-3</w:t>
       </w:r>
     </w:p>
     <w:p>
       <w:pPr>
-        <w:spacing w:after="120" w:line="259" w:lineRule="auto"/>
+        <w:spacing w:after="60" w:line="240" w:lineRule="auto"/>
         <w:jc w:val="both"/>
       </w:pPr>
       <w:r>
         <w:rPr>
           <w:rFonts w:ascii="Times New Roman" w:hAnsi="Times New Roman"/>
-          <w:sz w:val="21"/>
+          <w:sz w:val="19"/>
         </w:rPr>
         <w:t>[4] Gulyas, G., Kakuk, B., Dormo, A. et al. Cross-comparison of gut metagenomic profiling strategies. Commun Biol 7, 1445 (2024). https://doi.org/10.1038/s42003-024-07158-6</w:t>
       </w:r>
     </w:p>
     <w:p>
       <w:pPr>
-        <w:spacing w:after="120" w:line="259" w:lineRule="auto"/>
+        <w:spacing w:after="60" w:line="240" w:lineRule="auto"/>
         <w:jc w:val="both"/>
       </w:pPr>
       <w:r>
         <w:rPr>
           <w:rFonts w:ascii="Times New Roman" w:hAnsi="Times New Roman"/>
-          <w:sz w:val="21"/>
+          <w:sz w:val="19"/>
         </w:rPr>
         <w:t>[5] Cusco, A., Perez, D., Vines, J., Fabregas, N. &amp; Francino, O. Long-read metagenomics retrieves complete single-contig bacterial genomes from canine feces. BMC Genomics 22, 330 (2021). https://doi.org/10.1186/s12864-021-07607-0</w:t>
       </w:r>
     </w:p>
     <w:p>
       <w:pPr>
-        <w:spacing w:after="120" w:line="259" w:lineRule="auto"/>
+        <w:spacing w:after="60" w:line="240" w:lineRule="auto"/>
         <w:jc w:val="both"/>
       </w:pPr>
       <w:r>
         <w:rPr>
           <w:rFonts w:ascii="Times New Roman" w:hAnsi="Times New Roman"/>
-          <w:sz w:val="21"/>
+          <w:sz w:val="19"/>
         </w:rPr>
         <w:t>[6] Cusco, A., Perez, D., Vines, J., Fabregas, N. &amp; Francino, O. Novel canine high-quality metagenome-assembled genomes, prophages and host-associated plasmids provided by long-read metagenomics together with Hi-C proximity ligation. Microb Genom 8, 000802 (2022). https://doi.org/10.1099/mgen.0.000802</w:t>
       </w:r>
     </w:p>
     <w:p>
       <w:pPr>
-        <w:spacing w:after="120" w:line="259" w:lineRule="auto"/>
+        <w:spacing w:after="60" w:line="240" w:lineRule="auto"/>
         <w:jc w:val="both"/>
       </w:pPr>
       <w:r>
         <w:rPr>
           <w:rFonts w:ascii="Times New Roman" w:hAnsi="Times New Roman"/>
-          <w:sz w:val="21"/>
+          <w:sz w:val="19"/>
         </w:rPr>
         <w:t>[7] Branck, T. et al. Comprehensive profile of the companion animal gut microbiome integrating reference-based and reference-free methods. ISME J 18, wrae201 (2024). https://doi.org/10.1093/ismejo/wrae201</w:t>
       </w:r>
     </w:p>
     <w:p>
       <w:pPr>
-        <w:spacing w:after="120" w:line="259" w:lineRule="auto"/>
+        <w:spacing w:after="60" w:line="240" w:lineRule="auto"/>
         <w:jc w:val="both"/>
       </w:pPr>
       <w:r>
         <w:rPr>
           <w:rFonts w:ascii="Times New Roman" w:hAnsi="Times New Roman"/>
-          <w:sz w:val="21"/>
+          <w:sz w:val="19"/>
         </w:rPr>
         <w:t>[8] Castillo-Fernandez, J., Gilroy, R., Jones, R. B. et al. Waltham catalogue for the canine gut microbiome: a complete taxonomic and functional catalogue of the canine gut microbiome through novel metagenomic based genome discovery. Microbiome 14, 25 (2026). https://doi.org/10.1186/s40168-025-02265-w</w:t>
       </w:r>
     </w:p>
     <w:p>
       <w:pPr>
-        <w:spacing w:after="120" w:line="259" w:lineRule="auto"/>
+        <w:spacing w:after="60" w:line="240" w:lineRule="auto"/>
         <w:jc w:val="both"/>
       </w:pPr>
       <w:r>
         <w:rPr>
           <w:rFonts w:ascii="Times New Roman" w:hAnsi="Times New Roman"/>
-          <w:sz w:val="21"/>
+          <w:sz w:val="19"/>
         </w:rPr>
         <w:t>[9] Kolmogorov, M., Yuan, J., Lin, Y. et al. Assembly of long, error-prone reads using repeat graphs. Nat Biotechnol 37, 540-546 (2019). https://doi.org/10.1038/s41587-019-0072-8</w:t>
       </w:r>
     </w:p>
     <w:p>
       <w:pPr>
-        <w:spacing w:after="120" w:line="259" w:lineRule="auto"/>
+        <w:spacing w:after="60" w:line="240" w:lineRule="auto"/>
         <w:jc w:val="both"/>
       </w:pPr>
       <w:r>
         <w:rPr>
           <w:rFonts w:ascii="Times New Roman" w:hAnsi="Times New Roman"/>
-          <w:sz w:val="21"/>
+          <w:sz w:val="19"/>
         </w:rPr>
         <w:t>[10] Bertrand, D., Shaw, J., Narayan, M. et al. Hybrid metagenomic assembly enables high-resolution analysis of resistance determinants and mobile elements in human microbiomes. Nat Biotechnol 37, 937-944 (2019). https://doi.org/10.1038/s41587-019-0191-2</w:t>
       </w:r>
     </w:p>
     <w:p>
       <w:pPr>
-        <w:spacing w:after="120" w:line="259" w:lineRule="auto"/>
+        <w:spacing w:after="60" w:line="240" w:lineRule="auto"/>
         <w:jc w:val="both"/>
       </w:pPr>
       <w:r>
         <w:rPr>
           <w:rFonts w:ascii="Times New Roman" w:hAnsi="Times New Roman"/>
-          <w:sz w:val="21"/>
+          <w:sz w:val="19"/>
         </w:rPr>
         <w:t>[11] Qiu, Z., Yuan, L., Lian, C. A. et al. BASALT refines binning from metagenomic data and increases resolution of genome-resolved metagenomic analysis. Nat Commun 15, 2179 (2024). https://doi.org/10.1038/s41467-024-46539-7</w:t>
       </w:r>
     </w:p>
     <w:p>
       <w:pPr>
-        <w:spacing w:after="120" w:line="259" w:lineRule="auto"/>
+        <w:spacing w:after="60" w:line="240" w:lineRule="auto"/>
         <w:jc w:val="both"/>
       </w:pPr>
       <w:r>
         <w:rPr>
           <w:rFonts w:ascii="Times New Roman" w:hAnsi="Times New Roman"/>
-          <w:sz w:val="21"/>
+          <w:sz w:val="19"/>
         </w:rPr>
         <w:t>[12] Kang, D. D., Li, F., Kirton, E. et al. MetaBAT 2: an adaptive binning algorithm for robust and efficient genome reconstruction from metagenome assemblies. PeerJ 7, e7359 (2019). https://doi.org/10.7717/peerj.7359</w:t>
       </w:r>
     </w:p>
     <w:p>
       <w:pPr>
-        <w:spacing w:after="120" w:line="259" w:lineRule="auto"/>
+        <w:spacing w:after="60" w:line="240" w:lineRule="auto"/>
         <w:jc w:val="both"/>
       </w:pPr>
       <w:r>
         <w:rPr>
           <w:rFonts w:ascii="Times New Roman" w:hAnsi="Times New Roman"/>
-          <w:sz w:val="21"/>
+          <w:sz w:val="19"/>
         </w:rPr>
         <w:t>[13] Wu, Y.-W., Simmons, B. A. &amp; Singer, S. W. MaxBin 2.0: an automated binning algorithm to recover genomes from multiple metagenomic datasets. Bioinformatics 32, 605-607 (2016). https://doi.org/10.1093/bioinformatics/btv638</w:t>
       </w:r>
     </w:p>
     <w:p>
       <w:pPr>
-        <w:spacing w:after="120" w:line="259" w:lineRule="auto"/>
+        <w:spacing w:after="60" w:line="240" w:lineRule="auto"/>
         <w:jc w:val="both"/>
       </w:pPr>
       <w:r>
         <w:rPr>
           <w:rFonts w:ascii="Times New Roman" w:hAnsi="Times New Roman"/>
-          <w:sz w:val="21"/>
+          <w:sz w:val="19"/>
         </w:rPr>
         <w:t>[14] Alneberg, J., Bjarnason, B. S., de Bruijn, I. et al. Binning metagenomic contigs by coverage and composition. Nat Methods 11, 1144-1146 (2014). https://doi.org/10.1038/nmeth.3103</w:t>
       </w:r>
     </w:p>
     <w:p>
       <w:pPr>
-        <w:spacing w:after="120" w:line="259" w:lineRule="auto"/>
+        <w:spacing w:after="60" w:line="240" w:lineRule="auto"/>
         <w:jc w:val="both"/>
       </w:pPr>
       <w:r>
         <w:rPr>
           <w:rFonts w:ascii="Times New Roman" w:hAnsi="Times New Roman"/>
-          <w:sz w:val="21"/>
+          <w:sz w:val="19"/>
         </w:rPr>
         <w:t>[15] Pan, S., Zhu, C., Zhao, X.-M. &amp; Coelho, L. P. A deep siamese neural network improves metagenome-assembled genomes in microbiome datasets across different environments. Nat Commun 13, 2326 (2022). https://doi.org/10.1038/s41467-022-29843-y</w:t>
       </w:r>
     </w:p>
     <w:p>
       <w:pPr>
-        <w:spacing w:after="120" w:line="259" w:lineRule="auto"/>
+        <w:spacing w:after="60" w:line="240" w:lineRule="auto"/>
         <w:jc w:val="both"/>
       </w:pPr>
       <w:r>
         <w:rPr>
           <w:rFonts w:ascii="Times New Roman" w:hAnsi="Times New Roman"/>
-          <w:sz w:val="21"/>
+          <w:sz w:val="19"/>
         </w:rPr>
         <w:t>[16] Chklovski, A., Parks, D. H., Woodcroft, B. J. et al. CheckM2: a rapid, scalable and accurate tool for assessing microbial genome quality using machine learning. Nat Methods 20, 1203-1212 (2023). https://doi.org/10.1038/s41592-023-01940-w</w:t>
       </w:r>
     </w:p>
     <w:p>
       <w:pPr>
-        <w:spacing w:after="120" w:line="259" w:lineRule="auto"/>
+        <w:spacing w:after="60" w:line="240" w:lineRule="auto"/>
         <w:jc w:val="both"/>
       </w:pPr>
       <w:r>
         <w:rPr>
           <w:rFonts w:ascii="Times New Roman" w:hAnsi="Times New Roman"/>
-          <w:sz w:val="21"/>
+          <w:sz w:val="19"/>
         </w:rPr>
         <w:t>[17] Olm, M. R., Brown, C. T., Brooks, B. et al. dRep: a tool for fast and accurate genomic comparisons that enables improved genome recovery from metagenomes through de-replication. ISME J 11, 2864-2868 (2017). https://doi.org/10.1038/ismej.2017.126</w:t>
       </w:r>
     </w:p>
     <w:p>
       <w:pPr>
-        <w:spacing w:after="120" w:line="259" w:lineRule="auto"/>
+        <w:spacing w:after="60" w:line="240" w:lineRule="auto"/>
         <w:jc w:val="both"/>
       </w:pPr>
       <w:r>
         <w:rPr>
           <w:rFonts w:ascii="Times New Roman" w:hAnsi="Times New Roman"/>
-          <w:sz w:val="21"/>
+          <w:sz w:val="19"/>
         </w:rPr>
         <w:t>[18] Jain, C., Rodriguez-R, L. M., Phillippy, A. M. et al. High throughput ANI analysis of 90K prokaryotic genomes reveals clear species boundaries. Nat Commun 9, 5114 (2018). https://doi.org/10.1038/s41467-018-07641-9</w:t>
       </w:r>
     </w:p>
     <w:p>
       <w:pPr>
-        <w:spacing w:after="120" w:line="259" w:lineRule="auto"/>
+        <w:spacing w:after="60" w:line="240" w:lineRule="auto"/>
         <w:jc w:val="both"/>
       </w:pPr>
       <w:r>
         <w:rPr>
           <w:rFonts w:ascii="Times New Roman" w:hAnsi="Times New Roman"/>
-          <w:sz w:val="21"/>
+          <w:sz w:val="19"/>
         </w:rPr>
         <w:t>[19] Ondov, B. D., Treangen, T. J., Melsted, P. et al. Mash: fast genome and metagenome distance estimation using MinHash. Genome Biol 17, 132 (2016). https://doi.org/10.1186/s13059-016-0997-x</w:t>
       </w:r>
     </w:p>
     <w:p>
       <w:pPr>
-        <w:spacing w:after="120" w:line="259" w:lineRule="auto"/>
+        <w:spacing w:after="60" w:line="240" w:lineRule="auto"/>
         <w:jc w:val="both"/>
       </w:pPr>
       <w:r>
         <w:rPr>
           <w:rFonts w:ascii="Times New Roman" w:hAnsi="Times New Roman"/>
-          <w:sz w:val="21"/>
+          <w:sz w:val="19"/>
         </w:rPr>
         <w:t>[20] Bowers, R. M., Kyrpides, N. C., Stepanauskas, R. et al. Minimum information about a single amplified genome (MISAG) and a metagenome-assembled genome (MIMAG) of bacteria and archaea. Nat Biotechnol 35, 725-731 (2017). https://doi.org/10.1038/nbt.3893</w:t>
       </w:r>
     </w:p>
     <w:p>
       <w:pPr>
-        <w:spacing w:after="120" w:line="259" w:lineRule="auto"/>
+        <w:spacing w:after="60" w:line="240" w:lineRule="auto"/>
         <w:jc w:val="both"/>
       </w:pPr>
       <w:r>
         <w:rPr>
           <w:rFonts w:ascii="Times New Roman" w:hAnsi="Times New Roman"/>
-          <w:sz w:val="21"/>
+          <w:sz w:val="19"/>
         </w:rPr>
         <w:t>[21] Chaumeil, P.-A., Mussig, A. J., Hugenholtz, P. &amp; Parks, D. H. GTDB-Tk: a toolkit to classify genomes with the Genome Taxonomy Database. Bioinformatics 36, 1925-1927 (2020). https://doi.org/10.1093/bioinformatics/btz848</w:t>
       </w:r>
     </w:p>
     <w:p>
       <w:pPr>
-        <w:spacing w:after="120" w:line="259" w:lineRule="auto"/>
+        <w:spacing w:after="60" w:line="240" w:lineRule="auto"/>
         <w:jc w:val="both"/>
       </w:pPr>
       <w:r>
         <w:rPr>
           <w:rFonts w:ascii="Times New Roman" w:hAnsi="Times New Roman"/>
-          <w:sz w:val="21"/>
+          <w:sz w:val="19"/>
         </w:rPr>
         <w:t>[22] Camargo, A. P., Roux, S., Schulz, F. et al. Identification of mobile genetic elements with geNomad. Nat Biotechnol 42, 1303-1312 (2024). https://doi.org/10.1038/s41587-023-01953-y</w:t>
       </w:r>
     </w:p>
     <w:p>
       <w:pPr>
-        <w:spacing w:after="120" w:line="259" w:lineRule="auto"/>
+        <w:spacing w:after="60" w:line="240" w:lineRule="auto"/>
         <w:jc w:val="both"/>
       </w:pPr>
       <w:r>
         <w:rPr>
           <w:rFonts w:ascii="Times New Roman" w:hAnsi="Times New Roman"/>
-          <w:sz w:val="21"/>
+          <w:sz w:val="19"/>
         </w:rPr>
         <w:t>[23] Nayfach, S., Camargo, A. P., Schulz, F. et al. CheckV assesses the quality and completeness of metagenome-assembled viral genomes. Nat Biotechnol 39, 578-585 (2021). https://doi.org/10.1038/s41587-020-00774-7</w:t>
+      </w:r>
+    </w:p>
+    <w:p>
+      <w:pPr>
+        <w:spacing w:after="60" w:line="240" w:lineRule="auto"/>
+        <w:jc w:val="both"/>
+      </w:pPr>
+      <w:r>
+        <w:rPr>
+          <w:rFonts w:ascii="Times New Roman" w:hAnsi="Times New Roman"/>
+          <w:sz w:val="19"/>
+        </w:rPr>
+        <w:t>[24] Kakuk, B., Dormo, A., Taifi, A. et al. Canine Fecal Microbiome Dataset: Ultra-deep Multi-platform Sequencing Across Extraction and Library Protocols. Sci Data (2026). https://doi.org/10.1038/s41597-026-07594-5</w:t>
       </w:r>
     </w:p>
     <w:sectPr>

</xml_diff>